<commit_message>
dopuni dokumentaciju za vivado provjeru
</commit_message>
<xml_diff>
--- a/output/projektna_dokumentacija_rv32im_zbb.docx
+++ b/output/projektna_dokumentacija_rv32im_zbb.docx
@@ -487,14 +487,16 @@
     </w:p>
     <w:p>
       <w:pPr>
-        <w:spacing w:after="120" w:line="259" w:lineRule="auto"/>
+        <w:spacing w:after="80" w:line="240" w:lineRule="auto"/>
       </w:pPr>
       <w:r>
         <w:rPr>
           <w:rFonts w:ascii="Georgia" w:hAnsi="Georgia" w:eastAsia="Georgia"/>
+          <w:b w:val="0"/>
+          <w:i w:val="0"/>
           <w:sz w:val="21"/>
         </w:rPr>
-        <w:t>Kao osnova je uzet materijal sa predmeta Napredni mikroprocesorski sistemi, tacnije vjezba 2 koja obradjuje hardversku implementaciju single-cycle RISC-V procesora. U tom materijalu je procesor podijeljen na dvije velike cjeline: controlpath i datapath. Datapath obavlja prenos i obradu podataka, a controlpath na osnovu instrukcije daje signale koji upravljaju tom putanjom</w:t>
+        <w:t>Kao osnova je uzet materijal sa predmeta Napredni mikroprocesorski sistemi, tacnije vjezba 2 koja obradjuje hardversku implementaciju single-cycle RISC-V procesora. Iz tog materijala je preuzeta osnovna ideja procesora: jedan takt za izvrsavanje instrukcije, razdvajanje na controlpath i datapath, registarska banka, ALU, immediate blok i odvojeni memorijski interfejs za instrukcije i podatke. Preuzet je i skolski nacin organizacije projekta kroz Vivado/TCL fajlove, gdje se svi VHDL moduli dodaju u projekat i zatim pokrece behavioral simulacija</w:t>
       </w:r>
     </w:p>
     <w:p>
@@ -615,14 +617,16 @@
     </w:p>
     <w:p>
       <w:pPr>
-        <w:spacing w:after="120" w:line="259" w:lineRule="auto"/>
+        <w:spacing w:after="80" w:line="240" w:lineRule="auto"/>
       </w:pPr>
       <w:r>
         <w:rPr>
           <w:rFonts w:ascii="Georgia" w:hAnsi="Georgia" w:eastAsia="Georgia"/>
+          <w:b w:val="0"/>
+          <w:i w:val="0"/>
           <w:sz w:val="21"/>
         </w:rPr>
-        <w:t>U ovom projektu je ta baza zadrzana, ali je prosirena tako da pokrije siri RV32I skup, RV32M ekstenziju i dio Zbb instrukcija</w:t>
+        <w:t>U ovom projektu je ta baza zadrzana, ali je prosirena tako da pokrije siri RV32I skup, RV32M ekstenziju i dio Zbb instrukcija. Drugim rijecima, sa vjezbi je iskoriscena osnovna arhitektura i pocetni tok instrukcije, a u ovom radu su dodati novi dekoderi, novi ALU kodovi, novi immediate formati, dodatni izbori za PC i dodatni test scenariji</w:t>
       </w:r>
     </w:p>
     <w:p>
@@ -2465,16 +2469,118 @@
     <w:p>
       <w:pPr>
         <w:keepNext/>
-        <w:spacing w:before="280" w:after="140"/>
+        <w:pageBreakBefore/>
+        <w:spacing w:before="200" w:after="120"/>
       </w:pPr>
       <w:r>
         <w:rPr>
           <w:rFonts w:ascii="Georgia" w:hAnsi="Georgia" w:eastAsia="Georgia"/>
           <w:b/>
-          <w:color w:val="5B447A"/>
-          <w:sz w:val="29"/>
+          <w:i w:val="0"/>
+          <w:color w:val="634984"/>
+          <w:sz w:val="34"/>
         </w:rPr>
-        <w:t>8. zakljucak</w:t>
+        <w:t>8. provjera u vivadu</w:t>
+      </w:r>
+    </w:p>
+    <w:p>
+      <w:pPr>
+        <w:spacing w:after="80" w:line="240" w:lineRule="auto"/>
+      </w:pPr>
+      <w:r>
+        <w:rPr>
+          <w:rFonts w:ascii="Georgia" w:hAnsi="Georgia" w:eastAsia="Georgia"/>
+          <w:b w:val="0"/>
+          <w:i w:val="0"/>
+          <w:sz w:val="21"/>
+        </w:rPr>
+        <w:t>Provjera projekta u Vivadu radi se kroz Behavioral Simulation, gdje je top testbench TOP_testovi. Testbench ucitava program u instrukcionu memoriju, upisuje pocetne podatke u data memoriju i zatim prati store operacije koje procesor pravi</w:t>
+      </w:r>
+    </w:p>
+    <w:p>
+      <w:pPr>
+        <w:spacing w:after="80" w:line="240" w:lineRule="auto"/>
+      </w:pPr>
+      <w:r>
+        <w:rPr>
+          <w:rFonts w:ascii="Georgia" w:hAnsi="Georgia" w:eastAsia="Georgia"/>
+          <w:b w:val="0"/>
+          <w:i w:val="0"/>
+          <w:sz w:val="21"/>
+        </w:rPr>
+        <w:t>Ako je simulacija uspjesna, u Tcl konzoli treba da se pojavi poruka za scenario koji je pokrenut:</w:t>
+      </w:r>
+    </w:p>
+    <w:p>
+      <w:pPr>
+        <w:spacing w:after="80" w:line="240" w:lineRule="auto"/>
+      </w:pPr>
+      <w:r>
+        <w:rPr>
+          <w:rFonts w:ascii="Georgia" w:hAnsi="Georgia" w:eastAsia="Georgia"/>
+          <w:b w:val="0"/>
+          <w:i w:val="0"/>
+          <w:sz w:val="21"/>
+        </w:rPr>
+        <w:t>- za osnovni RV32I scenario: rv32i regression CPU test passed</w:t>
+      </w:r>
+    </w:p>
+    <w:p>
+      <w:pPr>
+        <w:spacing w:after="80" w:line="240" w:lineRule="auto"/>
+      </w:pPr>
+      <w:r>
+        <w:rPr>
+          <w:rFonts w:ascii="Georgia" w:hAnsi="Georgia" w:eastAsia="Georgia"/>
+          <w:b w:val="0"/>
+          <w:i w:val="0"/>
+          <w:sz w:val="21"/>
+        </w:rPr>
+        <w:t>- za Zbb scenario: Zbb CPU demo test passed</w:t>
+      </w:r>
+    </w:p>
+    <w:p>
+      <w:pPr>
+        <w:spacing w:after="80" w:line="240" w:lineRule="auto"/>
+      </w:pPr>
+      <w:r>
+        <w:rPr>
+          <w:rFonts w:ascii="Georgia" w:hAnsi="Georgia" w:eastAsia="Georgia"/>
+          <w:b w:val="0"/>
+          <w:i w:val="0"/>
+          <w:sz w:val="21"/>
+        </w:rPr>
+        <w:t>- za prosireni scenario: Extended CPU demo test passed</w:t>
+      </w:r>
+    </w:p>
+    <w:p>
+      <w:pPr>
+        <w:spacing w:after="80" w:line="240" w:lineRule="auto"/>
+      </w:pPr>
+      <w:r>
+        <w:rPr>
+          <w:rFonts w:ascii="Georgia" w:hAnsi="Georgia" w:eastAsia="Georgia"/>
+          <w:b w:val="0"/>
+          <w:i w:val="0"/>
+          <w:sz w:val="21"/>
+        </w:rPr>
+        <w:t>Ako adresa ili podatak kod store operacije nisu tacni, testbench prekida simulaciju preko assert failure poruke. Zbog toga je za provjeru najbitnije gledati Tcl konzolu i waveform signale PC-a, instrukcije, ALU operacije, write enable signala i podataka koji se upisuju u memoriju</w:t>
+      </w:r>
+    </w:p>
+    <w:p>
+      <w:pPr>
+        <w:keepNext/>
+        <w:spacing w:before="200" w:after="120"/>
+      </w:pPr>
+      <w:r>
+        <w:rPr>
+          <w:rFonts w:ascii="Georgia" w:hAnsi="Georgia" w:eastAsia="Georgia"/>
+          <w:b/>
+          <w:i w:val="0"/>
+          <w:color w:val="634984"/>
+          <w:sz w:val="34"/>
+        </w:rPr>
+        <w:t>9. zakljucak</w:t>
       </w:r>
     </w:p>
     <w:p>

</xml_diff>

<commit_message>
Restore merged project documentation
</commit_message>
<xml_diff>
--- a/output/projektna_dokumentacija_rv32im_zbb.docx
+++ b/output/projektna_dokumentacija_rv32im_zbb.docx
@@ -4,7 +4,7 @@
   <w:body>
     <w:p>
       <w:pPr>
-        <w:spacing w:after="40"/>
+        <w:spacing w:after="60" w:before="0" w:line="240" w:lineRule="auto"/>
         <w:rPr>
           <w:rFonts w:hint="eastAsia"/>
         </w:rPr>
@@ -32,7 +32,7 @@
     <w:p>
       <w:pPr>
         <w:keepNext/>
-        <w:spacing w:before="280" w:after="140"/>
+        <w:spacing w:before="0" w:after="60" w:line="240" w:lineRule="auto"/>
         <w:rPr>
           <w:rFonts w:hint="eastAsia"/>
         </w:rPr>
@@ -49,7 +49,7 @@
     </w:p>
     <w:p>
       <w:pPr>
-        <w:spacing w:after="30"/>
+        <w:spacing w:after="60" w:before="0" w:line="240" w:lineRule="auto"/>
         <w:ind w:left="280" w:hanging="160"/>
         <w:rPr>
           <w:rFonts w:hint="eastAsia"/>
@@ -65,7 +65,7 @@
     </w:p>
     <w:p>
       <w:pPr>
-        <w:spacing w:after="30"/>
+        <w:spacing w:after="60" w:before="0" w:line="240" w:lineRule="auto"/>
         <w:ind w:left="280" w:hanging="160"/>
         <w:rPr>
           <w:rFonts w:hint="eastAsia"/>
@@ -81,7 +81,7 @@
     </w:p>
     <w:p>
       <w:pPr>
-        <w:spacing w:after="30"/>
+        <w:spacing w:after="60" w:before="0" w:line="240" w:lineRule="auto"/>
         <w:ind w:left="280" w:hanging="160"/>
         <w:rPr>
           <w:rFonts w:hint="eastAsia"/>
@@ -97,7 +97,7 @@
     </w:p>
     <w:p>
       <w:pPr>
-        <w:spacing w:after="30"/>
+        <w:spacing w:after="60" w:before="0" w:line="240" w:lineRule="auto"/>
         <w:ind w:left="280" w:hanging="160"/>
         <w:rPr>
           <w:rFonts w:hint="eastAsia"/>
@@ -113,7 +113,7 @@
     </w:p>
     <w:p>
       <w:pPr>
-        <w:spacing w:after="30"/>
+        <w:spacing w:after="60" w:before="0" w:line="240" w:lineRule="auto"/>
         <w:ind w:left="280" w:hanging="160"/>
         <w:rPr>
           <w:rFonts w:hint="eastAsia"/>
@@ -129,7 +129,7 @@
     </w:p>
     <w:p>
       <w:pPr>
-        <w:spacing w:after="120" w:line="259" w:lineRule="auto"/>
+        <w:spacing w:after="60" w:line="240" w:lineRule="auto" w:before="0"/>
         <w:rPr>
           <w:rFonts w:hint="eastAsia"/>
         </w:rPr>
@@ -208,6 +208,12 @@
         <w:tblW w:w="0" w:type="auto"/>
         <w:jc w:val="center"/>
         <w:tblLook w:val="04A0" w:firstRow="1" w:lastRow="0" w:firstColumn="1" w:lastColumn="0" w:noHBand="0" w:noVBand="1"/>
+        <w:tblCellMar>
+          <w:top w:w="60" w:type="dxa"/>
+          <w:start w:w="80" w:type="dxa"/>
+          <w:bottom w:w="60" w:type="dxa"/>
+          <w:end w:w="80" w:type="dxa"/>
+        </w:tblCellMar>
       </w:tblPr>
       <w:tblGrid>
         <w:gridCol w:w="1536"/>
@@ -218,7 +224,6 @@
       </w:tblGrid>
       <w:tr>
         <w:trPr>
-          <w:trHeight w:val="472"/>
           <w:jc w:val="center"/>
         </w:trPr>
         <w:tc>
@@ -241,6 +246,7 @@
           </w:tcPr>
           <w:p>
             <w:pPr>
+              <w:spacing w:before="0" w:after="0" w:line="240" w:lineRule="auto"/>
               <w:jc w:val="center"/>
               <w:rPr>
                 <w:rFonts w:hint="eastAsia"/>
@@ -251,7 +257,7 @@
               <w:rPr>
                 <w:rFonts w:eastAsia="Georgia"/>
                 <w:b/>
-                <w:sz w:val="19"/>
+                <w:sz w:val="18"/>
               </w:rPr>
               <w:t>instr</w:t>
             </w:r>
@@ -260,7 +266,7 @@
               <w:rPr>
                 <w:rFonts w:eastAsia="Georgia"/>
                 <w:b/>
-                <w:sz w:val="19"/>
+                <w:sz w:val="18"/>
               </w:rPr>
               <w:t xml:space="preserve"> mem</w:t>
             </w:r>
@@ -286,6 +292,7 @@
           </w:tcPr>
           <w:p>
             <w:pPr>
+              <w:spacing w:before="0" w:after="0" w:line="240" w:lineRule="auto"/>
               <w:jc w:val="center"/>
               <w:rPr>
                 <w:rFonts w:hint="eastAsia"/>
@@ -295,7 +302,7 @@
               <w:rPr>
                 <w:rFonts w:eastAsia="Georgia"/>
                 <w:b/>
-                <w:sz w:val="19"/>
+                <w:sz w:val="18"/>
               </w:rPr>
               <w:t>kontrola</w:t>
             </w:r>
@@ -321,6 +328,7 @@
           </w:tcPr>
           <w:p>
             <w:pPr>
+              <w:spacing w:before="0" w:after="0" w:line="240" w:lineRule="auto"/>
               <w:jc w:val="center"/>
               <w:rPr>
                 <w:rFonts w:hint="eastAsia"/>
@@ -330,7 +338,7 @@
               <w:rPr>
                 <w:rFonts w:eastAsia="Georgia"/>
                 <w:b/>
-                <w:sz w:val="19"/>
+                <w:sz w:val="18"/>
               </w:rPr>
               <w:t>podaci</w:t>
             </w:r>
@@ -356,6 +364,7 @@
           </w:tcPr>
           <w:p>
             <w:pPr>
+              <w:spacing w:before="0" w:after="0" w:line="240" w:lineRule="auto"/>
               <w:jc w:val="center"/>
               <w:rPr>
                 <w:rFonts w:hint="eastAsia"/>
@@ -365,7 +374,7 @@
               <w:rPr>
                 <w:rFonts w:eastAsia="Georgia"/>
                 <w:b/>
-                <w:sz w:val="19"/>
+                <w:sz w:val="18"/>
               </w:rPr>
               <w:t>alu</w:t>
             </w:r>
@@ -391,6 +400,7 @@
           </w:tcPr>
           <w:p>
             <w:pPr>
+              <w:spacing w:before="0" w:after="0" w:line="240" w:lineRule="auto"/>
               <w:jc w:val="center"/>
               <w:rPr>
                 <w:rFonts w:hint="eastAsia"/>
@@ -400,7 +410,7 @@
               <w:rPr>
                 <w:rFonts w:eastAsia="Georgia"/>
                 <w:b/>
-                <w:sz w:val="19"/>
+                <w:sz w:val="18"/>
               </w:rPr>
               <w:t>data mem</w:t>
             </w:r>
@@ -409,7 +419,6 @@
       </w:tr>
       <w:tr>
         <w:trPr>
-          <w:trHeight w:val="265"/>
           <w:jc w:val="center"/>
         </w:trPr>
         <w:tc>
@@ -431,6 +440,7 @@
           </w:tcPr>
           <w:p>
             <w:pPr>
+              <w:spacing w:before="0" w:after="0" w:line="240" w:lineRule="auto"/>
               <w:jc w:val="center"/>
               <w:rPr>
                 <w:rFonts w:hint="eastAsia"/>
@@ -464,6 +474,7 @@
           </w:tcPr>
           <w:p>
             <w:pPr>
+              <w:spacing w:before="0" w:after="0" w:line="240" w:lineRule="auto"/>
               <w:jc w:val="center"/>
               <w:rPr>
                 <w:rFonts w:hint="eastAsia"/>
@@ -497,6 +508,7 @@
           </w:tcPr>
           <w:p>
             <w:pPr>
+              <w:spacing w:before="0" w:after="0" w:line="240" w:lineRule="auto"/>
               <w:jc w:val="center"/>
               <w:rPr>
                 <w:rFonts w:hint="eastAsia"/>
@@ -530,6 +542,7 @@
           </w:tcPr>
           <w:p>
             <w:pPr>
+              <w:spacing w:before="0" w:after="0" w:line="240" w:lineRule="auto"/>
               <w:jc w:val="center"/>
               <w:rPr>
                 <w:rFonts w:hint="eastAsia"/>
@@ -563,6 +576,7 @@
           </w:tcPr>
           <w:p>
             <w:pPr>
+              <w:spacing w:before="0" w:after="0" w:line="240" w:lineRule="auto"/>
               <w:jc w:val="center"/>
               <w:rPr>
                 <w:rFonts w:hint="eastAsia"/>
@@ -574,7 +588,7 @@
     </w:tbl>
     <w:p>
       <w:pPr>
-        <w:spacing w:after="160"/>
+        <w:spacing w:after="60" w:before="0" w:line="240" w:lineRule="auto"/>
         <w:jc w:val="center"/>
         <w:rPr>
           <w:rFonts w:hint="eastAsia"/>
@@ -620,7 +634,7 @@
     <w:p>
       <w:pPr>
         <w:keepNext/>
-        <w:spacing w:before="280" w:after="140"/>
+        <w:spacing w:before="0" w:after="60" w:line="240" w:lineRule="auto"/>
         <w:rPr>
           <w:rFonts w:hint="eastAsia"/>
         </w:rPr>
@@ -637,7 +651,7 @@
     </w:p>
     <w:p>
       <w:pPr>
-        <w:spacing w:after="80" w:line="240" w:lineRule="auto"/>
+        <w:spacing w:after="60" w:line="240" w:lineRule="auto" w:before="0"/>
         <w:rPr>
           <w:rFonts w:hint="eastAsia"/>
         </w:rPr>
@@ -735,7 +749,67 @@
     </w:p>
     <w:p>
       <w:pPr>
-        <w:spacing w:after="120" w:line="259" w:lineRule="auto"/>
+        <w:spacing w:before="0" w:after="60" w:line="240" w:lineRule="auto"/>
+      </w:pPr>
+      <w:r>
+        <w:t>Radi lakseg povezivanja sa polaznim materijalom, ispod je prikazan osnovni RISC-V datapath koji je posluzio kao referenca za organizaciju putanje podataka i memorijskih interfejsa.</w:t>
+      </w:r>
+    </w:p>
+    <w:p>
+      <w:pPr>
+        <w:jc w:val="center"/>
+      </w:pPr>
+      <w:r>
+        <w:drawing>
+          <wp:inline xmlns:a="http://schemas.openxmlformats.org/drawingml/2006/main" xmlns:pic="http://schemas.openxmlformats.org/drawingml/2006/picture">
+            <wp:extent cx="5303520" cy="2869117"/>
+            <wp:docPr id="1" name="Picture 1"/>
+            <wp:cNvGraphicFramePr>
+              <a:graphicFrameLocks noChangeAspect="1"/>
+            </wp:cNvGraphicFramePr>
+            <a:graphic>
+              <a:graphicData uri="http://schemas.openxmlformats.org/drawingml/2006/picture">
+                <pic:pic>
+                  <pic:nvPicPr>
+                    <pic:cNvPr id="0" name="crop_datapath_nocaption.png"/>
+                    <pic:cNvPicPr/>
+                  </pic:nvPicPr>
+                  <pic:blipFill>
+                    <a:blip r:embed="rId12"/>
+                    <a:stretch>
+                      <a:fillRect/>
+                    </a:stretch>
+                  </pic:blipFill>
+                  <pic:spPr>
+                    <a:xfrm>
+                      <a:off x="0" y="0"/>
+                      <a:ext cx="5303520" cy="2869117"/>
+                    </a:xfrm>
+                    <a:prstGeom prst="rect"/>
+                  </pic:spPr>
+                </pic:pic>
+              </a:graphicData>
+            </a:graphic>
+          </wp:inline>
+        </w:drawing>
+      </w:r>
+    </w:p>
+    <w:p>
+      <w:pPr>
+        <w:spacing w:before="0" w:after="60" w:line="240" w:lineRule="auto"/>
+        <w:jc w:val="center"/>
+      </w:pPr>
+      <w:r>
+        <w:rPr>
+          <w:i/>
+          <w:sz w:val="20"/>
+        </w:rPr>
+        <w:t>Slika 2. osnovni RISC-V datapath iz polaznog PDF materijala</w:t>
+      </w:r>
+    </w:p>
+    <w:p>
+      <w:pPr>
+        <w:spacing w:after="60" w:line="240" w:lineRule="auto" w:before="0"/>
         <w:rPr>
           <w:rFonts w:hint="eastAsia"/>
         </w:rPr>
@@ -749,7 +823,7 @@
     </w:p>
     <w:p>
       <w:pPr>
-        <w:spacing w:after="30"/>
+        <w:spacing w:after="0" w:before="0" w:line="240" w:lineRule="auto"/>
         <w:ind w:left="280" w:hanging="160"/>
         <w:rPr>
           <w:rFonts w:hint="eastAsia"/>
@@ -757,127 +831,15 @@
       </w:pPr>
       <w:r>
         <w:rPr>
-          <w:rFonts w:eastAsia="Georgia"/>
-          <w:sz w:val="20"/>
-        </w:rPr>
-        <w:t>- lw</w:t>
+          <w:rFonts w:ascii="Calibri" w:hAnsi="Calibri"/>
+          <w:sz w:val="22"/>
+        </w:rPr>
+        <w:t>lw   sw   add   sub   and   or   beq   addi</w:t>
       </w:r>
     </w:p>
     <w:p>
       <w:pPr>
-        <w:spacing w:after="30"/>
-        <w:ind w:left="280" w:hanging="160"/>
-        <w:rPr>
-          <w:rFonts w:hint="eastAsia"/>
-        </w:rPr>
-      </w:pPr>
-      <w:r>
-        <w:rPr>
-          <w:rFonts w:eastAsia="Georgia"/>
-          <w:sz w:val="20"/>
-        </w:rPr>
-        <w:t>- sw</w:t>
-      </w:r>
-    </w:p>
-    <w:p>
-      <w:pPr>
-        <w:spacing w:after="30"/>
-        <w:ind w:left="280" w:hanging="160"/>
-        <w:rPr>
-          <w:rFonts w:hint="eastAsia"/>
-        </w:rPr>
-      </w:pPr>
-      <w:r>
-        <w:rPr>
-          <w:rFonts w:eastAsia="Georgia"/>
-          <w:sz w:val="20"/>
-        </w:rPr>
-        <w:t>- add</w:t>
-      </w:r>
-    </w:p>
-    <w:p>
-      <w:pPr>
-        <w:spacing w:after="30"/>
-        <w:ind w:left="280" w:hanging="160"/>
-        <w:rPr>
-          <w:rFonts w:hint="eastAsia"/>
-        </w:rPr>
-      </w:pPr>
-      <w:r>
-        <w:rPr>
-          <w:rFonts w:eastAsia="Georgia"/>
-          <w:sz w:val="20"/>
-        </w:rPr>
-        <w:t>- sub</w:t>
-      </w:r>
-    </w:p>
-    <w:p>
-      <w:pPr>
-        <w:spacing w:after="30"/>
-        <w:ind w:left="280" w:hanging="160"/>
-        <w:rPr>
-          <w:rFonts w:hint="eastAsia"/>
-        </w:rPr>
-      </w:pPr>
-      <w:r>
-        <w:rPr>
-          <w:rFonts w:eastAsia="Georgia"/>
-          <w:sz w:val="20"/>
-        </w:rPr>
-        <w:t>- and</w:t>
-      </w:r>
-    </w:p>
-    <w:p>
-      <w:pPr>
-        <w:spacing w:after="30"/>
-        <w:ind w:left="280" w:hanging="160"/>
-        <w:rPr>
-          <w:rFonts w:hint="eastAsia"/>
-        </w:rPr>
-      </w:pPr>
-      <w:r>
-        <w:rPr>
-          <w:rFonts w:eastAsia="Georgia"/>
-          <w:sz w:val="20"/>
-        </w:rPr>
-        <w:t>- or</w:t>
-      </w:r>
-    </w:p>
-    <w:p>
-      <w:pPr>
-        <w:spacing w:after="30"/>
-        <w:ind w:left="280" w:hanging="160"/>
-        <w:rPr>
-          <w:rFonts w:hint="eastAsia"/>
-        </w:rPr>
-      </w:pPr>
-      <w:r>
-        <w:rPr>
-          <w:rFonts w:eastAsia="Georgia"/>
-          <w:sz w:val="20"/>
-        </w:rPr>
-        <w:t>- beq</w:t>
-      </w:r>
-    </w:p>
-    <w:p>
-      <w:pPr>
-        <w:spacing w:after="30"/>
-        <w:ind w:left="280" w:hanging="160"/>
-        <w:rPr>
-          <w:rFonts w:hint="eastAsia"/>
-        </w:rPr>
-      </w:pPr>
-      <w:r>
-        <w:rPr>
-          <w:rFonts w:eastAsia="Georgia"/>
-          <w:sz w:val="20"/>
-        </w:rPr>
-        <w:t>- addi</w:t>
-      </w:r>
-    </w:p>
-    <w:p>
-      <w:pPr>
-        <w:spacing w:after="80" w:line="240" w:lineRule="auto"/>
+        <w:spacing w:after="60" w:line="240" w:lineRule="auto" w:before="0"/>
         <w:rPr>
           <w:rFonts w:hint="eastAsia"/>
         </w:rPr>
@@ -993,7 +955,7 @@
       <w:pPr>
         <w:keepNext/>
         <w:pageBreakBefore/>
-        <w:spacing w:before="280" w:after="140"/>
+        <w:spacing w:before="0" w:after="60" w:line="240" w:lineRule="auto"/>
         <w:rPr>
           <w:rFonts w:hint="eastAsia"/>
         </w:rPr>
@@ -1005,7 +967,6 @@
           <w:color w:val="5B447A"/>
           <w:sz w:val="29"/>
         </w:rPr>
-        <w:lastRenderedPageBreak/>
         <w:t>3. struktura projekta</w:t>
       </w:r>
     </w:p>
@@ -1014,6 +975,12 @@
         <w:tblW w:w="0" w:type="auto"/>
         <w:jc w:val="center"/>
         <w:tblLook w:val="04A0" w:firstRow="1" w:lastRow="0" w:firstColumn="1" w:lastColumn="0" w:noHBand="0" w:noVBand="1"/>
+        <w:tblCellMar>
+          <w:top w:w="60" w:type="dxa"/>
+          <w:start w:w="80" w:type="dxa"/>
+          <w:bottom w:w="60" w:type="dxa"/>
+          <w:end w:w="80" w:type="dxa"/>
+        </w:tblCellMar>
       </w:tblPr>
       <w:tblGrid>
         <w:gridCol w:w="3406"/>
@@ -1043,6 +1010,7 @@
           </w:tcPr>
           <w:p>
             <w:pPr>
+              <w:spacing w:before="0" w:after="0" w:line="240" w:lineRule="auto"/>
               <w:jc w:val="center"/>
               <w:rPr>
                 <w:rFonts w:hint="eastAsia"/>
@@ -1052,7 +1020,7 @@
               <w:rPr>
                 <w:rFonts w:eastAsia="Georgia"/>
                 <w:b/>
-                <w:sz w:val="20"/>
+                <w:sz w:val="18"/>
               </w:rPr>
               <w:t>fajl</w:t>
             </w:r>
@@ -1078,6 +1046,7 @@
           </w:tcPr>
           <w:p>
             <w:pPr>
+              <w:spacing w:before="0" w:after="0" w:line="240" w:lineRule="auto"/>
               <w:jc w:val="center"/>
               <w:rPr>
                 <w:rFonts w:hint="eastAsia"/>
@@ -1087,7 +1056,7 @@
               <w:rPr>
                 <w:rFonts w:eastAsia="Georgia"/>
                 <w:b/>
-                <w:sz w:val="20"/>
+                <w:sz w:val="18"/>
               </w:rPr>
               <w:t>uloga</w:t>
             </w:r>
@@ -1117,6 +1086,7 @@
           </w:tcPr>
           <w:p>
             <w:pPr>
+              <w:spacing w:before="0" w:after="0" w:line="240" w:lineRule="auto"/>
               <w:rPr>
                 <w:rFonts w:hint="eastAsia"/>
               </w:rPr>
@@ -1125,7 +1095,7 @@
               <w:rPr>
                 <w:rFonts w:eastAsia="Georgia"/>
                 <w:b/>
-                <w:sz w:val="19"/>
+                <w:sz w:val="18"/>
               </w:rPr>
               <w:t>rv32i/TOP_RISCV.vhd</w:t>
             </w:r>
@@ -1150,6 +1120,7 @@
           </w:tcPr>
           <w:p>
             <w:pPr>
+              <w:spacing w:before="0" w:after="0" w:line="240" w:lineRule="auto"/>
               <w:rPr>
                 <w:rFonts w:hint="eastAsia"/>
               </w:rPr>
@@ -1157,7 +1128,7 @@
             <w:r>
               <w:rPr>
                 <w:rFonts w:eastAsia="Georgia"/>
-                <w:sz w:val="19"/>
+                <w:sz w:val="18"/>
               </w:rPr>
               <w:t>top modul koji povezuje kontrolu, putanju podataka i memorijske interfejse</w:t>
             </w:r>
@@ -1187,6 +1158,7 @@
           </w:tcPr>
           <w:p>
             <w:pPr>
+              <w:spacing w:before="0" w:after="0" w:line="240" w:lineRule="auto"/>
               <w:rPr>
                 <w:rFonts w:hint="eastAsia"/>
               </w:rPr>
@@ -1195,7 +1167,7 @@
               <w:rPr>
                 <w:rFonts w:eastAsia="Georgia"/>
                 <w:b/>
-                <w:sz w:val="19"/>
+                <w:sz w:val="18"/>
               </w:rPr>
               <w:t>rv32i/kontrola/ctrl_decoder.vhd</w:t>
             </w:r>
@@ -1220,6 +1192,7 @@
           </w:tcPr>
           <w:p>
             <w:pPr>
+              <w:spacing w:before="0" w:after="0" w:line="240" w:lineRule="auto"/>
               <w:rPr>
                 <w:rFonts w:hint="eastAsia"/>
               </w:rPr>
@@ -1227,7 +1200,7 @@
             <w:r>
               <w:rPr>
                 <w:rFonts w:eastAsia="Georgia"/>
-                <w:sz w:val="19"/>
+                <w:sz w:val="18"/>
               </w:rPr>
               <w:t>dekoduje opcode i pravi osnovne kontrolne signale</w:t>
             </w:r>
@@ -1257,6 +1230,7 @@
           </w:tcPr>
           <w:p>
             <w:pPr>
+              <w:spacing w:before="0" w:after="0" w:line="240" w:lineRule="auto"/>
               <w:rPr>
                 <w:rFonts w:hint="eastAsia"/>
               </w:rPr>
@@ -1265,7 +1239,7 @@
               <w:rPr>
                 <w:rFonts w:eastAsia="Georgia"/>
                 <w:b/>
-                <w:sz w:val="19"/>
+                <w:sz w:val="18"/>
               </w:rPr>
               <w:t>rv32i/kontrola/alu_decoder.vhd</w:t>
             </w:r>
@@ -1290,6 +1264,7 @@
           </w:tcPr>
           <w:p>
             <w:pPr>
+              <w:spacing w:before="0" w:after="0" w:line="240" w:lineRule="auto"/>
               <w:rPr>
                 <w:rFonts w:hint="eastAsia"/>
               </w:rPr>
@@ -1297,7 +1272,7 @@
             <w:r>
               <w:rPr>
                 <w:rFonts w:eastAsia="Georgia"/>
-                <w:sz w:val="19"/>
+                <w:sz w:val="18"/>
               </w:rPr>
               <w:t>na osnovu funct polja bira konkretnu ALU operaciju</w:t>
             </w:r>
@@ -1327,6 +1302,7 @@
           </w:tcPr>
           <w:p>
             <w:pPr>
+              <w:spacing w:before="0" w:after="0" w:line="240" w:lineRule="auto"/>
               <w:rPr>
                 <w:rFonts w:hint="eastAsia"/>
               </w:rPr>
@@ -1335,7 +1311,7 @@
               <w:rPr>
                 <w:rFonts w:eastAsia="Georgia"/>
                 <w:b/>
-                <w:sz w:val="19"/>
+                <w:sz w:val="18"/>
               </w:rPr>
               <w:t>rv32i/kontrola/kontrola.vhd</w:t>
             </w:r>
@@ -1360,6 +1336,7 @@
           </w:tcPr>
           <w:p>
             <w:pPr>
+              <w:spacing w:before="0" w:after="0" w:line="240" w:lineRule="auto"/>
               <w:rPr>
                 <w:rFonts w:hint="eastAsia"/>
               </w:rPr>
@@ -1367,7 +1344,7 @@
             <w:r>
               <w:rPr>
                 <w:rFonts w:eastAsia="Georgia"/>
-                <w:sz w:val="19"/>
+                <w:sz w:val="18"/>
               </w:rPr>
               <w:t>spaja kontrolne dekodere i bira sledeci PC</w:t>
             </w:r>
@@ -1397,6 +1374,7 @@
           </w:tcPr>
           <w:p>
             <w:pPr>
+              <w:spacing w:before="0" w:after="0" w:line="240" w:lineRule="auto"/>
               <w:rPr>
                 <w:rFonts w:hint="eastAsia"/>
               </w:rPr>
@@ -1405,7 +1383,7 @@
               <w:rPr>
                 <w:rFonts w:eastAsia="Georgia"/>
                 <w:b/>
-                <w:sz w:val="19"/>
+                <w:sz w:val="18"/>
               </w:rPr>
               <w:t>rv32i/podaci/podaci.vhd</w:t>
             </w:r>
@@ -1430,6 +1408,7 @@
           </w:tcPr>
           <w:p>
             <w:pPr>
+              <w:spacing w:before="0" w:after="0" w:line="240" w:lineRule="auto"/>
               <w:rPr>
                 <w:rFonts w:hint="eastAsia"/>
               </w:rPr>
@@ -1437,7 +1416,7 @@
             <w:r>
               <w:rPr>
                 <w:rFonts w:eastAsia="Georgia"/>
-                <w:sz w:val="19"/>
+                <w:sz w:val="18"/>
               </w:rPr>
               <w:t>sadrzi PC, mux logiku, branch provjeru, load prosirenje i povezivanje ALU-a</w:t>
             </w:r>
@@ -1467,6 +1446,7 @@
           </w:tcPr>
           <w:p>
             <w:pPr>
+              <w:spacing w:before="0" w:after="0" w:line="240" w:lineRule="auto"/>
               <w:rPr>
                 <w:rFonts w:hint="eastAsia"/>
               </w:rPr>
@@ -1475,7 +1455,7 @@
               <w:rPr>
                 <w:rFonts w:eastAsia="Georgia"/>
                 <w:b/>
-                <w:sz w:val="19"/>
+                <w:sz w:val="18"/>
               </w:rPr>
               <w:t>rv32i/podaci/ALU_simple.vhd</w:t>
             </w:r>
@@ -1500,6 +1480,7 @@
           </w:tcPr>
           <w:p>
             <w:pPr>
+              <w:spacing w:before="0" w:after="0" w:line="240" w:lineRule="auto"/>
               <w:rPr>
                 <w:rFonts w:hint="eastAsia"/>
               </w:rPr>
@@ -1507,7 +1488,7 @@
             <w:r>
               <w:rPr>
                 <w:rFonts w:eastAsia="Georgia"/>
-                <w:sz w:val="19"/>
+                <w:sz w:val="18"/>
               </w:rPr>
               <w:t>realizuje osnovne RV32I, RV32M i Zbb operacije</w:t>
             </w:r>
@@ -1537,6 +1518,7 @@
           </w:tcPr>
           <w:p>
             <w:pPr>
+              <w:spacing w:before="0" w:after="0" w:line="240" w:lineRule="auto"/>
               <w:rPr>
                 <w:rFonts w:hint="eastAsia"/>
               </w:rPr>
@@ -1545,7 +1527,7 @@
               <w:rPr>
                 <w:rFonts w:eastAsia="Georgia"/>
                 <w:b/>
-                <w:sz w:val="19"/>
+                <w:sz w:val="18"/>
               </w:rPr>
               <w:t>rv32i/podaci/immediate.vhd</w:t>
             </w:r>
@@ -1570,6 +1552,7 @@
           </w:tcPr>
           <w:p>
             <w:pPr>
+              <w:spacing w:before="0" w:after="0" w:line="240" w:lineRule="auto"/>
               <w:rPr>
                 <w:rFonts w:hint="eastAsia"/>
               </w:rPr>
@@ -1577,7 +1560,7 @@
             <w:r>
               <w:rPr>
                 <w:rFonts w:eastAsia="Georgia"/>
-                <w:sz w:val="19"/>
+                <w:sz w:val="18"/>
               </w:rPr>
               <w:t>izdvaja i prosiruje I, S, B, U i J immediate formate</w:t>
             </w:r>
@@ -1607,6 +1590,7 @@
           </w:tcPr>
           <w:p>
             <w:pPr>
+              <w:spacing w:before="0" w:after="0" w:line="240" w:lineRule="auto"/>
               <w:rPr>
                 <w:rFonts w:hint="eastAsia"/>
               </w:rPr>
@@ -1615,7 +1599,7 @@
               <w:rPr>
                 <w:rFonts w:eastAsia="Georgia"/>
                 <w:b/>
-                <w:sz w:val="19"/>
+                <w:sz w:val="18"/>
               </w:rPr>
               <w:t>rv32i/podaci/register_bank.vhd</w:t>
             </w:r>
@@ -1640,6 +1624,7 @@
           </w:tcPr>
           <w:p>
             <w:pPr>
+              <w:spacing w:before="0" w:after="0" w:line="240" w:lineRule="auto"/>
               <w:rPr>
                 <w:rFonts w:hint="eastAsia"/>
               </w:rPr>
@@ -1647,7 +1632,7 @@
             <w:r>
               <w:rPr>
                 <w:rFonts w:eastAsia="Georgia"/>
-                <w:sz w:val="19"/>
+                <w:sz w:val="18"/>
               </w:rPr>
               <w:t>registarska banka sa dva citanja, jednim upisom i x0 registrom</w:t>
             </w:r>
@@ -1677,6 +1662,7 @@
           </w:tcPr>
           <w:p>
             <w:pPr>
+              <w:spacing w:before="0" w:after="0" w:line="240" w:lineRule="auto"/>
               <w:rPr>
                 <w:rFonts w:hint="eastAsia"/>
               </w:rPr>
@@ -1685,7 +1671,7 @@
               <w:rPr>
                 <w:rFonts w:eastAsia="Georgia"/>
                 <w:b/>
-                <w:sz w:val="19"/>
+                <w:sz w:val="18"/>
               </w:rPr>
               <w:t>rv32i/paketi/alu_ops_pkg.vhd</w:t>
             </w:r>
@@ -1710,6 +1696,7 @@
           </w:tcPr>
           <w:p>
             <w:pPr>
+              <w:spacing w:before="0" w:after="0" w:line="240" w:lineRule="auto"/>
               <w:rPr>
                 <w:rFonts w:hint="eastAsia"/>
               </w:rPr>
@@ -1717,7 +1704,7 @@
             <w:r>
               <w:rPr>
                 <w:rFonts w:eastAsia="Georgia"/>
-                <w:sz w:val="19"/>
+                <w:sz w:val="18"/>
               </w:rPr>
               <w:t>interni kodovi za sve ALU operacije</w:t>
             </w:r>
@@ -1747,6 +1734,7 @@
           </w:tcPr>
           <w:p>
             <w:pPr>
+              <w:spacing w:before="0" w:after="0" w:line="240" w:lineRule="auto"/>
               <w:rPr>
                 <w:rFonts w:hint="eastAsia"/>
               </w:rPr>
@@ -1755,7 +1743,7 @@
               <w:rPr>
                 <w:rFonts w:eastAsia="Georgia"/>
                 <w:b/>
-                <w:sz w:val="19"/>
+                <w:sz w:val="18"/>
               </w:rPr>
               <w:t>rv32i/testovi/TOP_testovi.vhd</w:t>
             </w:r>
@@ -1780,6 +1768,7 @@
           </w:tcPr>
           <w:p>
             <w:pPr>
+              <w:spacing w:before="0" w:after="0" w:line="240" w:lineRule="auto"/>
               <w:rPr>
                 <w:rFonts w:hint="eastAsia"/>
               </w:rPr>
@@ -1787,7 +1776,7 @@
             <w:r>
               <w:rPr>
                 <w:rFonts w:eastAsia="Georgia"/>
-                <w:sz w:val="19"/>
+                <w:sz w:val="18"/>
               </w:rPr>
               <w:t>testbench koji ucitava program, pokrece CPU i provjerava store rezultate</w:t>
             </w:r>
@@ -1806,7 +1795,7 @@
     <w:p>
       <w:pPr>
         <w:keepNext/>
-        <w:spacing w:before="280" w:after="140"/>
+        <w:spacing w:before="0" w:after="60" w:line="240" w:lineRule="auto"/>
         <w:rPr>
           <w:rFonts w:hint="eastAsia"/>
         </w:rPr>
@@ -1823,7 +1812,7 @@
     </w:p>
     <w:p>
       <w:pPr>
-        <w:spacing w:after="120" w:line="259" w:lineRule="auto"/>
+        <w:spacing w:after="60" w:line="240" w:lineRule="auto" w:before="0"/>
         <w:rPr>
           <w:rFonts w:hint="eastAsia"/>
         </w:rPr>
@@ -1840,6 +1829,12 @@
         <w:tblW w:w="0" w:type="auto"/>
         <w:jc w:val="center"/>
         <w:tblLook w:val="04A0" w:firstRow="1" w:lastRow="0" w:firstColumn="1" w:lastColumn="0" w:noHBand="0" w:noVBand="1"/>
+        <w:tblCellMar>
+          <w:top w:w="60" w:type="dxa"/>
+          <w:start w:w="80" w:type="dxa"/>
+          <w:bottom w:w="60" w:type="dxa"/>
+          <w:end w:w="80" w:type="dxa"/>
+        </w:tblCellMar>
       </w:tblPr>
       <w:tblGrid>
         <w:gridCol w:w="2880"/>
@@ -1869,6 +1864,7 @@
           </w:tcPr>
           <w:p>
             <w:pPr>
+              <w:spacing w:before="0" w:after="0" w:line="240" w:lineRule="auto"/>
               <w:jc w:val="center"/>
               <w:rPr>
                 <w:rFonts w:hint="eastAsia"/>
@@ -1878,7 +1874,7 @@
               <w:rPr>
                 <w:rFonts w:eastAsia="Georgia"/>
                 <w:b/>
-                <w:sz w:val="20"/>
+                <w:sz w:val="18"/>
               </w:rPr>
               <w:t>dio</w:t>
             </w:r>
@@ -1904,6 +1900,7 @@
           </w:tcPr>
           <w:p>
             <w:pPr>
+              <w:spacing w:before="0" w:after="0" w:line="240" w:lineRule="auto"/>
               <w:jc w:val="center"/>
               <w:rPr>
                 <w:rFonts w:hint="eastAsia"/>
@@ -1913,7 +1910,7 @@
               <w:rPr>
                 <w:rFonts w:eastAsia="Georgia"/>
                 <w:b/>
-                <w:sz w:val="20"/>
+                <w:sz w:val="18"/>
               </w:rPr>
               <w:t>sta je prosireno</w:t>
             </w:r>
@@ -1943,6 +1940,7 @@
           </w:tcPr>
           <w:p>
             <w:pPr>
+              <w:spacing w:before="0" w:after="0" w:line="240" w:lineRule="auto"/>
               <w:rPr>
                 <w:rFonts w:hint="eastAsia"/>
               </w:rPr>
@@ -1951,7 +1949,7 @@
               <w:rPr>
                 <w:rFonts w:eastAsia="Georgia"/>
                 <w:b/>
-                <w:sz w:val="19"/>
+                <w:sz w:val="18"/>
               </w:rPr>
               <w:t>ctrl_decoder.vhd</w:t>
             </w:r>
@@ -1976,6 +1974,7 @@
           </w:tcPr>
           <w:p>
             <w:pPr>
+              <w:spacing w:before="0" w:after="0" w:line="240" w:lineRule="auto"/>
               <w:rPr>
                 <w:rFonts w:hint="eastAsia"/>
               </w:rPr>
@@ -1983,7 +1982,7 @@
             <w:r>
               <w:rPr>
                 <w:rFonts w:eastAsia="Georgia"/>
-                <w:sz w:val="19"/>
+                <w:sz w:val="18"/>
               </w:rPr>
               <w:t>dodati su lui, auipc, jal, jalr, fence, ecall, ebreak i novi kontrolni signali alu_src_a, rd_src, jump i jalr</w:t>
             </w:r>
@@ -2013,6 +2012,7 @@
           </w:tcPr>
           <w:p>
             <w:pPr>
+              <w:spacing w:before="0" w:after="0" w:line="240" w:lineRule="auto"/>
               <w:rPr>
                 <w:rFonts w:hint="eastAsia"/>
               </w:rPr>
@@ -2021,7 +2021,7 @@
               <w:rPr>
                 <w:rFonts w:eastAsia="Georgia"/>
                 <w:b/>
-                <w:sz w:val="19"/>
+                <w:sz w:val="18"/>
               </w:rPr>
               <w:t>alu_decoder.vhd</w:t>
             </w:r>
@@ -2046,6 +2046,7 @@
           </w:tcPr>
           <w:p>
             <w:pPr>
+              <w:spacing w:before="0" w:after="0" w:line="240" w:lineRule="auto"/>
               <w:rPr>
                 <w:rFonts w:hint="eastAsia"/>
               </w:rPr>
@@ -2053,7 +2054,7 @@
             <w:r>
               <w:rPr>
                 <w:rFonts w:eastAsia="Georgia"/>
-                <w:sz w:val="19"/>
+                <w:sz w:val="18"/>
               </w:rPr>
               <w:t>dodato je prepoznavanje RV32I ALU operacija, RV32M instrukcija preko funct7=0000001 i Zbb operacija preko funct7/funct12</w:t>
             </w:r>
@@ -2083,6 +2084,7 @@
           </w:tcPr>
           <w:p>
             <w:pPr>
+              <w:spacing w:before="0" w:after="0" w:line="240" w:lineRule="auto"/>
               <w:rPr>
                 <w:rFonts w:hint="eastAsia"/>
               </w:rPr>
@@ -2091,7 +2093,7 @@
               <w:rPr>
                 <w:rFonts w:eastAsia="Georgia"/>
                 <w:b/>
-                <w:sz w:val="19"/>
+                <w:sz w:val="18"/>
               </w:rPr>
               <w:t>podaci.vhd</w:t>
             </w:r>
@@ -2116,6 +2118,7 @@
           </w:tcPr>
           <w:p>
             <w:pPr>
+              <w:spacing w:before="0" w:after="0" w:line="240" w:lineRule="auto"/>
               <w:rPr>
                 <w:rFonts w:hint="eastAsia"/>
               </w:rPr>
@@ -2123,7 +2126,7 @@
             <w:r>
               <w:rPr>
                 <w:rFonts w:eastAsia="Georgia"/>
-                <w:sz w:val="19"/>
+                <w:sz w:val="18"/>
               </w:rPr>
               <w:t>dodata je 2-bitna selekcija PC-a, jalr adresa, branch provjera za vise uslova i izbor izvora za rd</w:t>
             </w:r>
@@ -2153,6 +2156,7 @@
           </w:tcPr>
           <w:p>
             <w:pPr>
+              <w:spacing w:before="0" w:after="0" w:line="240" w:lineRule="auto"/>
               <w:rPr>
                 <w:rFonts w:hint="eastAsia"/>
               </w:rPr>
@@ -2161,7 +2165,7 @@
               <w:rPr>
                 <w:rFonts w:eastAsia="Georgia"/>
                 <w:b/>
-                <w:sz w:val="19"/>
+                <w:sz w:val="18"/>
               </w:rPr>
               <w:t>immediate.vhd</w:t>
             </w:r>
@@ -2186,6 +2190,7 @@
           </w:tcPr>
           <w:p>
             <w:pPr>
+              <w:spacing w:before="0" w:after="0" w:line="240" w:lineRule="auto"/>
               <w:rPr>
                 <w:rFonts w:hint="eastAsia"/>
               </w:rPr>
@@ -2193,7 +2198,7 @@
             <w:r>
               <w:rPr>
                 <w:rFonts w:eastAsia="Georgia"/>
-                <w:sz w:val="19"/>
+                <w:sz w:val="18"/>
               </w:rPr>
               <w:t>pored I, S i B formata dodati su U i J format</w:t>
             </w:r>
@@ -2223,6 +2228,7 @@
           </w:tcPr>
           <w:p>
             <w:pPr>
+              <w:spacing w:before="0" w:after="0" w:line="240" w:lineRule="auto"/>
               <w:rPr>
                 <w:rFonts w:hint="eastAsia"/>
               </w:rPr>
@@ -2231,7 +2237,7 @@
               <w:rPr>
                 <w:rFonts w:eastAsia="Georgia"/>
                 <w:b/>
-                <w:sz w:val="19"/>
+                <w:sz w:val="18"/>
               </w:rPr>
               <w:lastRenderedPageBreak/>
               <w:t>ALU_simple.vhd</w:t>
@@ -2257,6 +2263,7 @@
           </w:tcPr>
           <w:p>
             <w:pPr>
+              <w:spacing w:before="0" w:after="0" w:line="240" w:lineRule="auto"/>
               <w:rPr>
                 <w:rFonts w:hint="eastAsia"/>
               </w:rPr>
@@ -2264,7 +2271,7 @@
             <w:r>
               <w:rPr>
                 <w:rFonts w:eastAsia="Georgia"/>
-                <w:sz w:val="19"/>
+                <w:sz w:val="18"/>
               </w:rPr>
               <w:t>dodate su operacije za poredjenje, pomjeranje, mnozenje, dijeljenje, ostatak i bit-manipulation</w:t>
             </w:r>
@@ -2294,6 +2301,7 @@
           </w:tcPr>
           <w:p>
             <w:pPr>
+              <w:spacing w:before="0" w:after="0" w:line="240" w:lineRule="auto"/>
               <w:rPr>
                 <w:rFonts w:hint="eastAsia"/>
               </w:rPr>
@@ -2302,7 +2310,7 @@
               <w:rPr>
                 <w:rFonts w:eastAsia="Georgia"/>
                 <w:b/>
-                <w:sz w:val="19"/>
+                <w:sz w:val="18"/>
               </w:rPr>
               <w:t>testovi</w:t>
             </w:r>
@@ -2327,6 +2335,7 @@
           </w:tcPr>
           <w:p>
             <w:pPr>
+              <w:spacing w:before="0" w:after="0" w:line="240" w:lineRule="auto"/>
               <w:rPr>
                 <w:rFonts w:hint="eastAsia"/>
               </w:rPr>
@@ -2334,7 +2343,7 @@
             <w:r>
               <w:rPr>
                 <w:rFonts w:eastAsia="Georgia"/>
-                <w:sz w:val="19"/>
+                <w:sz w:val="18"/>
               </w:rPr>
               <w:t>dodati su scenariji za RV32I regresiju, Zbb demonstraciju i prosireni CPU demo</w:t>
             </w:r>
@@ -2353,7 +2362,7 @@
     <w:p>
       <w:pPr>
         <w:keepNext/>
-        <w:spacing w:before="280" w:after="140"/>
+        <w:spacing w:before="0" w:after="60" w:line="240" w:lineRule="auto"/>
         <w:rPr>
           <w:rFonts w:hint="eastAsia"/>
         </w:rPr>
@@ -2370,7 +2379,7 @@
     </w:p>
     <w:p>
       <w:pPr>
-        <w:spacing w:after="120" w:line="259" w:lineRule="auto"/>
+        <w:spacing w:after="60" w:line="240" w:lineRule="auto" w:before="0"/>
         <w:rPr>
           <w:rFonts w:hint="eastAsia"/>
         </w:rPr>
@@ -2380,6 +2389,66 @@
           <w:rFonts w:eastAsia="Georgia"/>
         </w:rPr>
         <w:t>Instrukcije su dodate tako da se sto vise iskoristi postojeci single-cycle tok. Sve sto je racunska operacija ide kroz ALU, sve sto mijenja tok programa ide kroz PC mux, a sve sto koristi konstantu ide kroz immediate blok</w:t>
+      </w:r>
+    </w:p>
+    <w:p>
+      <w:pPr>
+        <w:spacing w:before="0" w:after="60" w:line="240" w:lineRule="auto"/>
+      </w:pPr>
+      <w:r>
+        <w:t>Za dekodovanje prosirenih instrukcija korisno je imati pregled osnovnih RISC-V formata i rasporeda njihovih polja, jer se upravo na tim poljima zasniva razlikovanje opcode, funct i immediate dijelova.</w:t>
+      </w:r>
+    </w:p>
+    <w:p>
+      <w:pPr>
+        <w:jc w:val="center"/>
+      </w:pPr>
+      <w:r>
+        <w:drawing>
+          <wp:inline xmlns:a="http://schemas.openxmlformats.org/drawingml/2006/main" xmlns:pic="http://schemas.openxmlformats.org/drawingml/2006/picture">
+            <wp:extent cx="5303520" cy="3671668"/>
+            <wp:docPr id="2" name="Picture 2"/>
+            <wp:cNvGraphicFramePr>
+              <a:graphicFrameLocks noChangeAspect="1"/>
+            </wp:cNvGraphicFramePr>
+            <a:graphic>
+              <a:graphicData uri="http://schemas.openxmlformats.org/drawingml/2006/picture">
+                <pic:pic>
+                  <pic:nvPicPr>
+                    <pic:cNvPr id="0" name="crop_instr_wide.png"/>
+                    <pic:cNvPicPr/>
+                  </pic:nvPicPr>
+                  <pic:blipFill>
+                    <a:blip r:embed="rId13"/>
+                    <a:stretch>
+                      <a:fillRect/>
+                    </a:stretch>
+                  </pic:blipFill>
+                  <pic:spPr>
+                    <a:xfrm>
+                      <a:off x="0" y="0"/>
+                      <a:ext cx="5303520" cy="3671668"/>
+                    </a:xfrm>
+                    <a:prstGeom prst="rect"/>
+                  </pic:spPr>
+                </pic:pic>
+              </a:graphicData>
+            </a:graphic>
+          </wp:inline>
+        </w:drawing>
+      </w:r>
+    </w:p>
+    <w:p>
+      <w:pPr>
+        <w:spacing w:before="0" w:after="60" w:line="240" w:lineRule="auto"/>
+        <w:jc w:val="center"/>
+      </w:pPr>
+      <w:r>
+        <w:rPr>
+          <w:i/>
+          <w:sz w:val="20"/>
+        </w:rPr>
+        <w:t>Slika 3. pregled formata i polja RISC-V instrukcija relevantnih za dekodovanje</w:t>
       </w:r>
     </w:p>
     <w:tbl>
@@ -2387,6 +2456,12 @@
         <w:tblW w:w="0" w:type="auto"/>
         <w:jc w:val="center"/>
         <w:tblLook w:val="04A0" w:firstRow="1" w:lastRow="0" w:firstColumn="1" w:lastColumn="0" w:noHBand="0" w:noVBand="1"/>
+        <w:tblCellMar>
+          <w:top w:w="60" w:type="dxa"/>
+          <w:start w:w="80" w:type="dxa"/>
+          <w:bottom w:w="60" w:type="dxa"/>
+          <w:end w:w="80" w:type="dxa"/>
+        </w:tblCellMar>
       </w:tblPr>
       <w:tblGrid>
         <w:gridCol w:w="2232"/>
@@ -2416,6 +2491,7 @@
           </w:tcPr>
           <w:p>
             <w:pPr>
+              <w:spacing w:before="20" w:after="20" w:line="240" w:lineRule="auto"/>
               <w:jc w:val="center"/>
               <w:rPr>
                 <w:rFonts w:hint="eastAsia"/>
@@ -2425,7 +2501,7 @@
               <w:rPr>
                 <w:rFonts w:eastAsia="Georgia"/>
                 <w:b/>
-                <w:sz w:val="20"/>
+                <w:sz w:val="18"/>
               </w:rPr>
               <w:t>grupa</w:t>
             </w:r>
@@ -2451,6 +2527,7 @@
           </w:tcPr>
           <w:p>
             <w:pPr>
+              <w:spacing w:before="20" w:after="20" w:line="240" w:lineRule="auto"/>
               <w:jc w:val="center"/>
               <w:rPr>
                 <w:rFonts w:hint="eastAsia"/>
@@ -2460,7 +2537,7 @@
               <w:rPr>
                 <w:rFonts w:eastAsia="Georgia"/>
                 <w:b/>
-                <w:sz w:val="20"/>
+                <w:sz w:val="18"/>
               </w:rPr>
               <w:t>instrukcije</w:t>
             </w:r>
@@ -2469,7 +2546,6 @@
       </w:tr>
       <w:tr>
         <w:trPr>
-          <w:trHeight w:val="471"/>
           <w:jc w:val="center"/>
         </w:trPr>
         <w:tc>
@@ -2491,6 +2567,7 @@
           </w:tcPr>
           <w:p>
             <w:pPr>
+              <w:spacing w:before="20" w:after="20" w:line="240" w:lineRule="auto"/>
               <w:rPr>
                 <w:rFonts w:hint="eastAsia"/>
               </w:rPr>
@@ -2500,7 +2577,7 @@
               <w:rPr>
                 <w:rFonts w:eastAsia="Georgia"/>
                 <w:b/>
-                <w:sz w:val="19"/>
+                <w:sz w:val="18"/>
               </w:rPr>
               <w:t>dodatni</w:t>
             </w:r>
@@ -2509,7 +2586,7 @@
               <w:rPr>
                 <w:rFonts w:eastAsia="Georgia"/>
                 <w:b/>
-                <w:sz w:val="19"/>
+                <w:sz w:val="18"/>
               </w:rPr>
               <w:t xml:space="preserve"> RV32I</w:t>
             </w:r>
@@ -2534,6 +2611,7 @@
           </w:tcPr>
           <w:p>
             <w:pPr>
+              <w:spacing w:before="20" w:after="20" w:line="240" w:lineRule="auto"/>
               <w:rPr>
                 <w:rFonts w:hint="eastAsia"/>
               </w:rPr>
@@ -2541,7 +2619,7 @@
             <w:r>
               <w:rPr>
                 <w:rFonts w:eastAsia="Georgia"/>
-                <w:sz w:val="19"/>
+                <w:sz w:val="18"/>
               </w:rPr>
               <w:t>lui, auipc, jal, jalr, bne, blt, bge, bltu, bgeu, lb, lh, lbu, lhu, sb, sh, slti, sltiu, xori, ori, andi, slli, srli, srai, sll, slt, sltu, xor, srl, sra, fence, ecall, ebreak</w:t>
             </w:r>
@@ -2550,7 +2628,6 @@
       </w:tr>
       <w:tr>
         <w:trPr>
-          <w:trHeight w:val="30"/>
           <w:jc w:val="center"/>
         </w:trPr>
         <w:tc>
@@ -2572,6 +2649,7 @@
           </w:tcPr>
           <w:p>
             <w:pPr>
+              <w:spacing w:before="20" w:after="20" w:line="240" w:lineRule="auto"/>
               <w:rPr>
                 <w:rFonts w:hint="eastAsia"/>
               </w:rPr>
@@ -2580,7 +2658,7 @@
               <w:rPr>
                 <w:rFonts w:eastAsia="Georgia"/>
                 <w:b/>
-                <w:sz w:val="19"/>
+                <w:sz w:val="18"/>
               </w:rPr>
               <w:t>RV32M</w:t>
             </w:r>
@@ -2605,6 +2683,7 @@
           </w:tcPr>
           <w:p>
             <w:pPr>
+              <w:spacing w:before="20" w:after="20" w:line="240" w:lineRule="auto"/>
               <w:rPr>
                 <w:rFonts w:hint="eastAsia"/>
               </w:rPr>
@@ -2612,7 +2691,7 @@
             <w:r>
               <w:rPr>
                 <w:rFonts w:eastAsia="Georgia"/>
-                <w:sz w:val="19"/>
+                <w:sz w:val="18"/>
               </w:rPr>
               <w:t>mul, mulh, mulhsu, mulhu, div, divu, rem, remu</w:t>
             </w:r>
@@ -2642,6 +2721,7 @@
           </w:tcPr>
           <w:p>
             <w:pPr>
+              <w:spacing w:before="20" w:after="20" w:line="240" w:lineRule="auto"/>
               <w:rPr>
                 <w:rFonts w:hint="eastAsia"/>
               </w:rPr>
@@ -2651,7 +2731,7 @@
               <w:rPr>
                 <w:rFonts w:eastAsia="Georgia"/>
                 <w:b/>
-                <w:sz w:val="19"/>
+                <w:sz w:val="18"/>
               </w:rPr>
               <w:t>Zbb</w:t>
             </w:r>
@@ -2660,7 +2740,7 @@
               <w:rPr>
                 <w:rFonts w:eastAsia="Georgia"/>
                 <w:b/>
-                <w:sz w:val="19"/>
+                <w:sz w:val="18"/>
               </w:rPr>
               <w:t xml:space="preserve"> </w:t>
             </w:r>
@@ -2669,7 +2749,7 @@
               <w:rPr>
                 <w:rFonts w:eastAsia="Georgia"/>
                 <w:b/>
-                <w:sz w:val="19"/>
+                <w:sz w:val="18"/>
               </w:rPr>
               <w:t>podskup</w:t>
             </w:r>
@@ -2695,6 +2775,7 @@
           </w:tcPr>
           <w:p>
             <w:pPr>
+              <w:spacing w:before="20" w:after="20" w:line="240" w:lineRule="auto"/>
               <w:rPr>
                 <w:rFonts w:hint="eastAsia"/>
               </w:rPr>
@@ -2702,7 +2783,7 @@
             <w:r>
               <w:rPr>
                 <w:rFonts w:eastAsia="Georgia"/>
-                <w:sz w:val="19"/>
+                <w:sz w:val="18"/>
               </w:rPr>
               <w:t>andn, orn, xnor, clz, ctz, cpop, rol, ror, sext.b, sext.h</w:t>
             </w:r>
@@ -2720,7 +2801,7 @@
     </w:p>
     <w:p>
       <w:pPr>
-        <w:spacing w:after="120" w:line="259" w:lineRule="auto"/>
+        <w:spacing w:after="60" w:line="240" w:lineRule="auto" w:before="0"/>
         <w:rPr>
           <w:rFonts w:hint="eastAsia"/>
         </w:rPr>
@@ -2734,7 +2815,7 @@
     </w:p>
     <w:p>
       <w:pPr>
-        <w:spacing w:after="120" w:line="259" w:lineRule="auto"/>
+        <w:spacing w:after="60" w:line="240" w:lineRule="auto" w:before="0"/>
         <w:rPr>
           <w:rFonts w:hint="eastAsia"/>
         </w:rPr>
@@ -2749,7 +2830,7 @@
     <w:p>
       <w:pPr>
         <w:keepNext/>
-        <w:spacing w:before="280" w:after="140"/>
+        <w:spacing w:before="0" w:after="60" w:line="240" w:lineRule="auto"/>
         <w:rPr>
           <w:rFonts w:hint="eastAsia"/>
         </w:rPr>
@@ -2766,7 +2847,7 @@
     </w:p>
     <w:p>
       <w:pPr>
-        <w:spacing w:after="30"/>
+        <w:spacing w:after="60" w:before="0" w:line="240" w:lineRule="auto"/>
         <w:ind w:left="280" w:hanging="160"/>
         <w:rPr>
           <w:rFonts w:hint="eastAsia"/>
@@ -2782,7 +2863,7 @@
     </w:p>
     <w:p>
       <w:pPr>
-        <w:spacing w:after="30"/>
+        <w:spacing w:after="60" w:before="0" w:line="240" w:lineRule="auto"/>
         <w:ind w:left="280" w:hanging="160"/>
         <w:rPr>
           <w:rFonts w:hint="eastAsia"/>
@@ -2798,7 +2879,7 @@
     </w:p>
     <w:p>
       <w:pPr>
-        <w:spacing w:after="30"/>
+        <w:spacing w:after="60" w:before="0" w:line="240" w:lineRule="auto"/>
         <w:ind w:left="280" w:hanging="160"/>
         <w:rPr>
           <w:rFonts w:hint="eastAsia"/>
@@ -2814,7 +2895,7 @@
     </w:p>
     <w:p>
       <w:pPr>
-        <w:spacing w:after="30"/>
+        <w:spacing w:after="60" w:before="0" w:line="240" w:lineRule="auto"/>
         <w:ind w:left="280" w:hanging="160"/>
         <w:rPr>
           <w:rFonts w:hint="eastAsia"/>
@@ -2830,7 +2911,7 @@
     </w:p>
     <w:p>
       <w:pPr>
-        <w:spacing w:after="30"/>
+        <w:spacing w:after="60" w:before="0" w:line="240" w:lineRule="auto"/>
         <w:ind w:left="280" w:hanging="160"/>
         <w:rPr>
           <w:rFonts w:hint="eastAsia"/>
@@ -2846,7 +2927,7 @@
     </w:p>
     <w:p>
       <w:pPr>
-        <w:spacing w:after="30"/>
+        <w:spacing w:after="60" w:before="0" w:line="240" w:lineRule="auto"/>
         <w:ind w:left="280" w:hanging="160"/>
         <w:rPr>
           <w:rFonts w:hint="eastAsia"/>
@@ -2862,7 +2943,7 @@
     </w:p>
     <w:p>
       <w:pPr>
-        <w:spacing w:after="30"/>
+        <w:spacing w:after="60" w:before="0" w:line="240" w:lineRule="auto"/>
         <w:ind w:left="280" w:hanging="160"/>
         <w:rPr>
           <w:rFonts w:hint="eastAsia"/>
@@ -2878,7 +2959,7 @@
     </w:p>
     <w:p>
       <w:pPr>
-        <w:spacing w:after="120" w:line="259" w:lineRule="auto"/>
+        <w:spacing w:after="60" w:line="240" w:lineRule="auto" w:before="0"/>
         <w:rPr>
           <w:rFonts w:hint="eastAsia"/>
         </w:rPr>
@@ -2893,7 +2974,7 @@
     <w:p>
       <w:pPr>
         <w:keepNext/>
-        <w:spacing w:before="280" w:after="140"/>
+        <w:spacing w:before="0" w:after="60" w:line="240" w:lineRule="auto"/>
         <w:rPr>
           <w:rFonts w:hint="eastAsia"/>
         </w:rPr>
@@ -2910,7 +2991,7 @@
     </w:p>
     <w:p>
       <w:pPr>
-        <w:spacing w:after="120" w:line="259" w:lineRule="auto"/>
+        <w:spacing w:after="60" w:line="240" w:lineRule="auto" w:before="0"/>
         <w:rPr>
           <w:rFonts w:hint="eastAsia"/>
         </w:rPr>
@@ -2927,6 +3008,12 @@
         <w:tblW w:w="0" w:type="auto"/>
         <w:jc w:val="center"/>
         <w:tblLook w:val="04A0" w:firstRow="1" w:lastRow="0" w:firstColumn="1" w:lastColumn="0" w:noHBand="0" w:noVBand="1"/>
+        <w:tblCellMar>
+          <w:top w:w="60" w:type="dxa"/>
+          <w:start w:w="80" w:type="dxa"/>
+          <w:bottom w:w="60" w:type="dxa"/>
+          <w:end w:w="80" w:type="dxa"/>
+        </w:tblCellMar>
       </w:tblPr>
       <w:tblGrid>
         <w:gridCol w:w="3024"/>
@@ -2956,6 +3043,7 @@
           </w:tcPr>
           <w:p>
             <w:pPr>
+              <w:spacing w:before="0" w:after="0" w:line="240" w:lineRule="auto"/>
               <w:jc w:val="center"/>
               <w:rPr>
                 <w:rFonts w:hint="eastAsia"/>
@@ -2965,7 +3053,7 @@
               <w:rPr>
                 <w:rFonts w:eastAsia="Georgia"/>
                 <w:b/>
-                <w:sz w:val="20"/>
+                <w:sz w:val="18"/>
               </w:rPr>
               <w:lastRenderedPageBreak/>
               <w:t>test program</w:t>
@@ -2992,6 +3080,7 @@
           </w:tcPr>
           <w:p>
             <w:pPr>
+              <w:spacing w:before="0" w:after="0" w:line="240" w:lineRule="auto"/>
               <w:jc w:val="center"/>
               <w:rPr>
                 <w:rFonts w:hint="eastAsia"/>
@@ -3001,7 +3090,7 @@
               <w:rPr>
                 <w:rFonts w:eastAsia="Georgia"/>
                 <w:b/>
-                <w:sz w:val="20"/>
+                <w:sz w:val="18"/>
               </w:rPr>
               <w:t>sta provjerava</w:t>
             </w:r>
@@ -3031,6 +3120,7 @@
           </w:tcPr>
           <w:p>
             <w:pPr>
+              <w:spacing w:before="0" w:after="0" w:line="240" w:lineRule="auto"/>
               <w:rPr>
                 <w:rFonts w:hint="eastAsia"/>
               </w:rPr>
@@ -3039,7 +3129,7 @@
               <w:rPr>
                 <w:rFonts w:eastAsia="Georgia"/>
                 <w:b/>
-                <w:sz w:val="19"/>
+                <w:sz w:val="18"/>
               </w:rPr>
               <w:t>rv32i_regression.txt</w:t>
             </w:r>
@@ -3064,6 +3154,7 @@
           </w:tcPr>
           <w:p>
             <w:pPr>
+              <w:spacing w:before="0" w:after="0" w:line="240" w:lineRule="auto"/>
               <w:rPr>
                 <w:rFonts w:hint="eastAsia"/>
               </w:rPr>
@@ -3071,7 +3162,7 @@
             <w:r>
               <w:rPr>
                 <w:rFonts w:eastAsia="Georgia"/>
-                <w:sz w:val="19"/>
+                <w:sz w:val="18"/>
               </w:rPr>
               <w:t>provjerava osnovne RV32I instrukcije i sluzi da se vidi da prosirenja nisu pokvarila bazu</w:t>
             </w:r>
@@ -3101,6 +3192,7 @@
           </w:tcPr>
           <w:p>
             <w:pPr>
+              <w:spacing w:before="0" w:after="0" w:line="240" w:lineRule="auto"/>
               <w:rPr>
                 <w:rFonts w:hint="eastAsia"/>
               </w:rPr>
@@ -3109,7 +3201,7 @@
               <w:rPr>
                 <w:rFonts w:eastAsia="Georgia"/>
                 <w:b/>
-                <w:sz w:val="19"/>
+                <w:sz w:val="18"/>
               </w:rPr>
               <w:t>zbb_demo.txt</w:t>
             </w:r>
@@ -3134,6 +3226,7 @@
           </w:tcPr>
           <w:p>
             <w:pPr>
+              <w:spacing w:before="0" w:after="0" w:line="240" w:lineRule="auto"/>
               <w:rPr>
                 <w:rFonts w:hint="eastAsia"/>
               </w:rPr>
@@ -3141,7 +3234,7 @@
             <w:r>
               <w:rPr>
                 <w:rFonts w:eastAsia="Georgia"/>
-                <w:sz w:val="19"/>
+                <w:sz w:val="18"/>
               </w:rPr>
               <w:t>provjerava bit-manipulation instrukcije iz Zbb podskupa</w:t>
             </w:r>
@@ -3171,6 +3264,7 @@
           </w:tcPr>
           <w:p>
             <w:pPr>
+              <w:spacing w:before="0" w:after="0" w:line="240" w:lineRule="auto"/>
               <w:rPr>
                 <w:rFonts w:hint="eastAsia"/>
               </w:rPr>
@@ -3179,7 +3273,7 @@
               <w:rPr>
                 <w:rFonts w:eastAsia="Georgia"/>
                 <w:b/>
-                <w:sz w:val="19"/>
+                <w:sz w:val="18"/>
               </w:rPr>
               <w:t>extended_demo.txt</w:t>
             </w:r>
@@ -3204,6 +3298,7 @@
           </w:tcPr>
           <w:p>
             <w:pPr>
+              <w:spacing w:before="0" w:after="0" w:line="240" w:lineRule="auto"/>
               <w:rPr>
                 <w:rFonts w:hint="eastAsia"/>
               </w:rPr>
@@ -3211,7 +3306,7 @@
             <w:r>
               <w:rPr>
                 <w:rFonts w:eastAsia="Georgia"/>
-                <w:sz w:val="19"/>
+                <w:sz w:val="18"/>
               </w:rPr>
               <w:t>provjerava siri scenario sa memorijom, grananjem, skokovima, RV32M i sistemskim instrukcijama</w:t>
             </w:r>
@@ -3229,7 +3324,7 @@
     </w:p>
     <w:p>
       <w:pPr>
-        <w:spacing w:after="120" w:line="259" w:lineRule="auto"/>
+        <w:spacing w:after="60" w:line="240" w:lineRule="auto" w:before="0"/>
         <w:rPr>
           <w:rFonts w:hint="eastAsia"/>
         </w:rPr>
@@ -3244,8 +3339,7 @@
     <w:p>
       <w:pPr>
         <w:keepNext/>
-        <w:pageBreakBefore/>
-        <w:spacing w:before="200" w:after="120"/>
+        <w:spacing w:before="0" w:after="60" w:line="240" w:lineRule="auto"/>
         <w:rPr>
           <w:rFonts w:hint="eastAsia"/>
         </w:rPr>
@@ -3257,13 +3351,12 @@
           <w:color w:val="634984"/>
           <w:sz w:val="34"/>
         </w:rPr>
-        <w:lastRenderedPageBreak/>
         <w:t>8. provjera u vivadu</w:t>
       </w:r>
     </w:p>
     <w:p>
       <w:pPr>
-        <w:spacing w:after="80" w:line="240" w:lineRule="auto"/>
+        <w:spacing w:after="60" w:line="240" w:lineRule="auto" w:before="0"/>
         <w:rPr>
           <w:rFonts w:hint="eastAsia"/>
         </w:rPr>
@@ -3277,7 +3370,7 @@
     </w:p>
     <w:p>
       <w:pPr>
-        <w:spacing w:after="80" w:line="240" w:lineRule="auto"/>
+        <w:spacing w:after="60" w:line="240" w:lineRule="auto" w:before="0"/>
         <w:rPr>
           <w:rFonts w:hint="eastAsia"/>
         </w:rPr>
@@ -3291,7 +3384,7 @@
     </w:p>
     <w:p>
       <w:pPr>
-        <w:spacing w:after="80" w:line="240" w:lineRule="auto"/>
+        <w:spacing w:after="60" w:line="240" w:lineRule="auto" w:before="0"/>
         <w:rPr>
           <w:rFonts w:hint="eastAsia"/>
         </w:rPr>
@@ -3305,7 +3398,7 @@
     </w:p>
     <w:p>
       <w:pPr>
-        <w:spacing w:after="80" w:line="240" w:lineRule="auto"/>
+        <w:spacing w:after="60" w:line="240" w:lineRule="auto" w:before="0"/>
         <w:rPr>
           <w:rFonts w:hint="eastAsia"/>
         </w:rPr>
@@ -3319,7 +3412,7 @@
     </w:p>
     <w:p>
       <w:pPr>
-        <w:spacing w:after="80" w:line="240" w:lineRule="auto"/>
+        <w:spacing w:after="60" w:line="240" w:lineRule="auto" w:before="0"/>
         <w:rPr>
           <w:rFonts w:hint="eastAsia"/>
         </w:rPr>
@@ -3333,7 +3426,7 @@
     </w:p>
     <w:p>
       <w:pPr>
-        <w:spacing w:after="80" w:line="240" w:lineRule="auto"/>
+        <w:spacing w:after="60" w:line="240" w:lineRule="auto" w:before="0"/>
         <w:rPr>
           <w:rFonts w:hint="eastAsia"/>
         </w:rPr>
@@ -3347,8 +3440,476 @@
     </w:p>
     <w:p>
       <w:pPr>
+        <w:spacing w:before="120" w:after="80" w:line="240" w:lineRule="auto"/>
+      </w:pPr>
+      <w:r>
+        <w:rPr>
+          <w:rFonts w:ascii="Calibri" w:hAnsi="Calibri"/>
+          <w:b/>
+          <w:sz w:val="24"/>
+        </w:rPr>
+        <w:t>8.1 rezultati provjere (09.05.2026)</w:t>
+      </w:r>
+    </w:p>
+    <w:p>
+      <w:pPr>
+        <w:spacing w:before="0" w:after="60" w:line="240" w:lineRule="auto"/>
+      </w:pPr>
+      <w:r>
+        <w:rPr>
+          <w:rFonts w:ascii="Calibri" w:hAnsi="Calibri"/>
+          <w:b w:val="0"/>
+          <w:sz w:val="22"/>
+        </w:rPr>
+        <w:t>Projekat je pokrenut i provjeren kompletno iz batch okruzenja. Dokaz nije samo otvaranje projekta, nego sinteza plus testbench poruke koje nastaju tek kada su ocekivani store rezultati prosli bez assert failure greske.</w:t>
+      </w:r>
+    </w:p>
+    <w:p>
+      <w:pPr>
+        <w:spacing w:before="0" w:after="60" w:line="240" w:lineRule="auto"/>
+      </w:pPr>
+      <w:r>
+        <w:rPr>
+          <w:rFonts w:ascii="Calibri" w:hAnsi="Calibri"/>
+          <w:b w:val="0"/>
+          <w:sz w:val="22"/>
+        </w:rPr>
+        <w:t>Pokrenute komande:</w:t>
+      </w:r>
+    </w:p>
+    <w:p>
+      <w:pPr>
+        <w:spacing w:before="0" w:after="60" w:line="240" w:lineRule="auto"/>
+      </w:pPr>
+      <w:r>
+        <w:rPr>
+          <w:rFonts w:ascii="Calibri" w:hAnsi="Calibri"/>
+          <w:b w:val="0"/>
+          <w:sz w:val="22"/>
+        </w:rPr>
+        <w:t>- GHDL: powershell -ExecutionPolicy Bypass -File .\scripts\run_ghdl_tests.ps1 -Scenario all</w:t>
+      </w:r>
+    </w:p>
+    <w:p>
+      <w:pPr>
+        <w:spacing w:before="0" w:after="60" w:line="240" w:lineRule="auto"/>
+      </w:pPr>
+      <w:r>
+        <w:rPr>
+          <w:rFonts w:ascii="Calibri" w:hAnsi="Calibri"/>
+          <w:b w:val="0"/>
+          <w:sz w:val="22"/>
+        </w:rPr>
+        <w:t>- Vivado: powershell -ExecutionPolicy Bypass -File .\scripts\run_vivado_checks.ps1 -Scenario all</w:t>
+      </w:r>
+    </w:p>
+    <w:p>
+      <w:pPr>
+        <w:spacing w:before="0" w:after="60" w:line="240" w:lineRule="auto"/>
+      </w:pPr>
+      <w:r>
+        <w:rPr>
+          <w:rFonts w:ascii="Calibri" w:hAnsi="Calibri"/>
+          <w:b w:val="0"/>
+          <w:sz w:val="22"/>
+        </w:rPr>
+        <w:t>Rezultat provjere:</w:t>
+      </w:r>
+    </w:p>
+    <w:p>
+      <w:pPr>
+        <w:spacing w:before="0" w:after="60" w:line="240" w:lineRule="auto"/>
+      </w:pPr>
+      <w:r>
+        <w:rPr>
+          <w:rFonts w:ascii="Calibri" w:hAnsi="Calibri"/>
+          <w:b w:val="0"/>
+          <w:sz w:val="22"/>
+        </w:rPr>
+        <w:t>- Vivado 2025.2, ciljna komponenta xc7z010clg400-1</w:t>
+      </w:r>
+    </w:p>
+    <w:p>
+      <w:pPr>
+        <w:spacing w:before="0" w:after="60" w:line="240" w:lineRule="auto"/>
+      </w:pPr>
+      <w:r>
+        <w:rPr>
+          <w:rFonts w:ascii="Calibri" w:hAnsi="Calibri"/>
+          <w:b w:val="0"/>
+          <w:sz w:val="22"/>
+        </w:rPr>
+        <w:t>- sinteza: SYNTH_STATUS=synth_design Complete!</w:t>
+      </w:r>
+    </w:p>
+    <w:p>
+      <w:pPr>
+        <w:spacing w:before="0" w:after="60" w:line="240" w:lineRule="auto"/>
+      </w:pPr>
+      <w:r>
+        <w:rPr>
+          <w:rFonts w:ascii="Calibri" w:hAnsi="Calibri"/>
+          <w:b w:val="0"/>
+          <w:sz w:val="22"/>
+        </w:rPr>
+        <w:t>- ALU test: ALU extended tests passed</w:t>
+      </w:r>
+    </w:p>
+    <w:p>
+      <w:pPr>
+        <w:spacing w:before="0" w:after="60" w:line="240" w:lineRule="auto"/>
+      </w:pPr>
+      <w:r>
+        <w:rPr>
+          <w:rFonts w:ascii="Calibri" w:hAnsi="Calibri"/>
+          <w:b w:val="0"/>
+          <w:sz w:val="22"/>
+        </w:rPr>
+        <w:t>- Zbb CPU demo: Zbb CPU demo test passed</w:t>
+      </w:r>
+    </w:p>
+    <w:p>
+      <w:pPr>
+        <w:spacing w:before="0" w:after="60" w:line="240" w:lineRule="auto"/>
+      </w:pPr>
+      <w:r>
+        <w:rPr>
+          <w:rFonts w:ascii="Calibri" w:hAnsi="Calibri"/>
+          <w:b w:val="0"/>
+          <w:sz w:val="22"/>
+        </w:rPr>
+        <w:t>- RV32I regresija: rv32i regression CPU test passed</w:t>
+      </w:r>
+    </w:p>
+    <w:p>
+      <w:pPr>
+        <w:spacing w:before="0" w:after="60" w:line="240" w:lineRule="auto"/>
+      </w:pPr>
+      <w:r>
+        <w:rPr>
+          <w:rFonts w:ascii="Calibri" w:hAnsi="Calibri"/>
+          <w:b w:val="0"/>
+          <w:sz w:val="22"/>
+        </w:rPr>
+        <w:t>- prosireni CPU demo: Extended CPU demo test passed</w:t>
+      </w:r>
+    </w:p>
+    <w:p>
+      <w:pPr>
+        <w:spacing w:before="0" w:after="60" w:line="240" w:lineRule="auto"/>
+      </w:pPr>
+      <w:r>
+        <w:rPr>
+          <w:rFonts w:ascii="Calibri" w:hAnsi="Calibri"/>
+          <w:b w:val="0"/>
+          <w:sz w:val="22"/>
+        </w:rPr>
+        <w:t>- u Vivado logu je zabiljezeno 78 linija CPU store observed; testbench za svaki store poredi adresu i podatak sa ocekivanim nizovima.</w:t>
+      </w:r>
+    </w:p>
+    <w:p>
+      <w:pPr>
+        <w:spacing w:before="0" w:after="60" w:line="240" w:lineRule="auto"/>
+      </w:pPr>
+      <w:r>
+        <w:rPr>
+          <w:rFonts w:ascii="Calibri" w:hAnsi="Calibri"/>
+          <w:b w:val="0"/>
+          <w:sz w:val="22"/>
+        </w:rPr>
+        <w:t>Izvod iz Vivado Tcl konzole:</w:t>
+      </w:r>
+    </w:p>
+    <w:p>
+      <w:pPr>
+        <w:spacing w:before="0" w:after="20" w:line="240" w:lineRule="auto"/>
+      </w:pPr>
+      <w:r>
+        <w:rPr>
+          <w:rFonts w:ascii="Consolas" w:hAnsi="Consolas"/>
+          <w:b w:val="0"/>
+          <w:sz w:val="18"/>
+        </w:rPr>
+        <w:t># Vivado v2025.2 (64-bit)</w:t>
+      </w:r>
+    </w:p>
+    <w:p>
+      <w:pPr>
+        <w:spacing w:before="0" w:after="20" w:line="240" w:lineRule="auto"/>
+      </w:pPr>
+      <w:r>
+        <w:rPr>
+          <w:rFonts w:ascii="Consolas" w:hAnsi="Consolas"/>
+          <w:b w:val="0"/>
+          <w:sz w:val="18"/>
+        </w:rPr>
+        <w:t>Running Vivado synthesis check...</w:t>
+      </w:r>
+    </w:p>
+    <w:p>
+      <w:pPr>
+        <w:spacing w:before="0" w:after="20" w:line="240" w:lineRule="auto"/>
+      </w:pPr>
+      <w:r>
+        <w:rPr>
+          <w:rFonts w:ascii="Consolas" w:hAnsi="Consolas"/>
+          <w:b w:val="0"/>
+          <w:sz w:val="18"/>
+        </w:rPr>
+        <w:t>SYNTH_STATUS=synth_design Complete!</w:t>
+      </w:r>
+    </w:p>
+    <w:p>
+      <w:pPr>
+        <w:spacing w:before="0" w:after="20" w:line="240" w:lineRule="auto"/>
+      </w:pPr>
+      <w:r>
+        <w:rPr>
+          <w:rFonts w:ascii="Consolas" w:hAnsi="Consolas"/>
+          <w:b w:val="0"/>
+          <w:sz w:val="18"/>
+        </w:rPr>
+        <w:t>Running Vivado behavioral simulation for ALU_zbb_tb...</w:t>
+      </w:r>
+    </w:p>
+    <w:p>
+      <w:pPr>
+        <w:spacing w:before="0" w:after="20" w:line="240" w:lineRule="auto"/>
+      </w:pPr>
+      <w:r>
+        <w:rPr>
+          <w:rFonts w:ascii="Consolas" w:hAnsi="Consolas"/>
+          <w:b w:val="0"/>
+          <w:sz w:val="18"/>
+        </w:rPr>
+        <w:t>Note: ALU extended tests passed</w:t>
+      </w:r>
+    </w:p>
+    <w:p>
+      <w:pPr>
+        <w:spacing w:before="0" w:after="20" w:line="240" w:lineRule="auto"/>
+      </w:pPr>
+      <w:r>
+        <w:rPr>
+          <w:rFonts w:ascii="Consolas" w:hAnsi="Consolas"/>
+          <w:b w:val="0"/>
+          <w:sz w:val="18"/>
+        </w:rPr>
+        <w:t>Running Vivado behavioral simulation for TOP_testovi...</w:t>
+      </w:r>
+    </w:p>
+    <w:p>
+      <w:pPr>
+        <w:spacing w:before="0" w:after="20" w:line="240" w:lineRule="auto"/>
+      </w:pPr>
+      <w:r>
+        <w:rPr>
+          <w:rFonts w:ascii="Consolas" w:hAnsi="Consolas"/>
+          <w:b w:val="0"/>
+          <w:sz w:val="18"/>
+        </w:rPr>
+        <w:t>Note: Zbb CPU demo test passed</w:t>
+      </w:r>
+    </w:p>
+    <w:p>
+      <w:pPr>
+        <w:spacing w:before="0" w:after="20" w:line="240" w:lineRule="auto"/>
+      </w:pPr>
+      <w:r>
+        <w:rPr>
+          <w:rFonts w:ascii="Consolas" w:hAnsi="Consolas"/>
+          <w:b w:val="0"/>
+          <w:sz w:val="18"/>
+        </w:rPr>
+        <w:t>Running Vivado behavioral simulation for TOP_testovi...</w:t>
+      </w:r>
+    </w:p>
+    <w:p>
+      <w:pPr>
+        <w:spacing w:before="0" w:after="20" w:line="240" w:lineRule="auto"/>
+      </w:pPr>
+      <w:r>
+        <w:rPr>
+          <w:rFonts w:ascii="Consolas" w:hAnsi="Consolas"/>
+          <w:b w:val="0"/>
+          <w:sz w:val="18"/>
+        </w:rPr>
+        <w:t>Note: rv32i regression CPU test passed</w:t>
+      </w:r>
+    </w:p>
+    <w:p>
+      <w:pPr>
+        <w:spacing w:before="0" w:after="20" w:line="240" w:lineRule="auto"/>
+      </w:pPr>
+      <w:r>
+        <w:rPr>
+          <w:rFonts w:ascii="Consolas" w:hAnsi="Consolas"/>
+          <w:b w:val="0"/>
+          <w:sz w:val="18"/>
+        </w:rPr>
+        <w:t>Running Vivado behavioral simulation for TOP_testovi...</w:t>
+      </w:r>
+    </w:p>
+    <w:p>
+      <w:pPr>
+        <w:spacing w:before="0" w:after="20" w:line="240" w:lineRule="auto"/>
+      </w:pPr>
+      <w:r>
+        <w:rPr>
+          <w:rFonts w:ascii="Consolas" w:hAnsi="Consolas"/>
+          <w:b w:val="0"/>
+          <w:sz w:val="18"/>
+        </w:rPr>
+        <w:t>Note: Extended CPU demo test passed</w:t>
+      </w:r>
+    </w:p>
+    <w:p>
+      <w:pPr>
+        <w:spacing w:before="0" w:after="20" w:line="240" w:lineRule="auto"/>
+      </w:pPr>
+      <w:r>
+        <w:rPr>
+          <w:rFonts w:ascii="Consolas" w:hAnsi="Consolas"/>
+          <w:b w:val="0"/>
+          <w:sz w:val="18"/>
+        </w:rPr>
+        <w:t>Vivado checks completed successfully.</w:t>
+      </w:r>
+    </w:p>
+    <w:p>
+      <w:pPr>
+        <w:spacing w:before="0" w:after="60" w:line="240" w:lineRule="auto"/>
+      </w:pPr>
+      <w:r>
+        <w:rPr>
+          <w:rFonts w:ascii="Calibri" w:hAnsi="Calibri"/>
+          <w:b w:val="0"/>
+          <w:sz w:val="22"/>
+        </w:rPr>
+        <w:t>Detaljni logovi su sacuvani u output/vivado_all_2026-05-09.log i output/ghdl_all_2026-05-09.log.</w:t>
+      </w:r>
+    </w:p>
+    <w:p>
+      <w:pPr>
+        <w:spacing w:before="0" w:after="60" w:line="240" w:lineRule="auto"/>
+      </w:pPr>
+      <w:r>
+        <w:rPr>
+          <w:rFonts w:ascii="Calibri" w:hAnsi="Calibri"/>
+          <w:b w:val="0"/>
+          <w:sz w:val="22"/>
+        </w:rPr>
+        <w:t>Napomena: GHDL/Vivado prikazuju numeric_std metavalue upozorenja na pocetku simulacije. Ona nisu pad testa, jer simulacija nastavlja rad i zavrsava se pass porukama. Pravi pad bi bio assert failure iz testbencha.</w:t>
+      </w:r>
+    </w:p>
+    <w:p>
+      <w:pPr>
+        <w:spacing w:before="0" w:after="80" w:line="240" w:lineRule="auto"/>
+      </w:pPr>
+      <w:r>
+        <w:rPr>
+          <w:rFonts w:ascii="Calibri" w:hAnsi="Calibri"/>
+          <w:b/>
+          <w:sz w:val="24"/>
+        </w:rPr>
+        <w:t>8.2 uputstvo za Vivado i screenshot dokaz</w:t>
+      </w:r>
+    </w:p>
+    <w:p>
+      <w:pPr>
+        <w:spacing w:before="0" w:after="60" w:line="240" w:lineRule="auto"/>
+      </w:pPr>
+      <w:r>
+        <w:rPr>
+          <w:rFonts w:ascii="Calibri" w:hAnsi="Calibri"/>
+          <w:b w:val="0"/>
+          <w:sz w:val="22"/>
+        </w:rPr>
+        <w:t>Za rucno otvaranje projekta u Vivadu treba pokrenuti Vivado 2025.2, izabrati Open Project i otvoriti rv32i/vivado_projekat/vivado_projekat.xpr. Upozorenje o dugoj putanji nije VHDL greska i moze se nastaviti.</w:t>
+      </w:r>
+    </w:p>
+    <w:p>
+      <w:pPr>
+        <w:spacing w:before="0" w:after="60" w:line="240" w:lineRule="auto"/>
+      </w:pPr>
+      <w:r>
+        <w:rPr>
+          <w:rFonts w:ascii="Calibri" w:hAnsi="Calibri"/>
+          <w:b w:val="0"/>
+          <w:sz w:val="22"/>
+        </w:rPr>
+        <w:t>Za osnovnu GUI provjeru ide se na Simulation -&gt; Run Simulation -&gt; Run Behavioral Simulation. Podrazumijevani scenario je Zbb demo, pa je ocekivana poruka u Tcl konzoli: Note: Zbb CPU demo test passed.</w:t>
+      </w:r>
+    </w:p>
+    <w:p>
+      <w:pPr>
+        <w:spacing w:before="0" w:after="60" w:line="240" w:lineRule="auto"/>
+      </w:pPr>
+      <w:r>
+        <w:rPr>
+          <w:rFonts w:ascii="Calibri" w:hAnsi="Calibri"/>
+          <w:b w:val="0"/>
+          <w:sz w:val="22"/>
+        </w:rPr>
+        <w:t>Za kompletan dokaz je prakticnije pokrenuti batch provjeru iz PowerShell-a: powershell -ExecutionPolicy Bypass -File .\scripts\run_vivado_checks.ps1 -Scenario all. Tada se jednim pokretanjem dobijaju sinteza, ALU test, Zbb demo, RV32I regresija i prosireni CPU demo.</w:t>
+      </w:r>
+    </w:p>
+    <w:p>
+      <w:pPr>
+        <w:spacing w:before="0" w:after="60" w:line="240" w:lineRule="auto"/>
+      </w:pPr>
+      <w:r>
+        <w:rPr>
+          <w:rFonts w:ascii="Calibri" w:hAnsi="Calibri"/>
+          <w:b w:val="0"/>
+          <w:sz w:val="22"/>
+        </w:rPr>
+        <w:t>Ako treba screenshot, najkorisnije je screenshotovati Tcl konzolu gdje se vide SYNTH_STATUS=synth_design Complete!, ALU extended tests passed, Zbb CPU demo test passed, rv32i regression CPU test passed, Extended CPU demo test passed i Vivado checks completed successfully.</w:t>
+      </w:r>
+    </w:p>
+    <w:p>
+      <w:pPr>
+        <w:spacing w:before="0" w:after="60" w:line="240" w:lineRule="auto"/>
+      </w:pPr>
+      <w:r>
+        <w:rPr>
+          <w:rFonts w:ascii="Calibri" w:hAnsi="Calibri"/>
+          <w:b w:val="0"/>
+          <w:sz w:val="22"/>
+        </w:rPr>
+        <w:t>Waveform screenshot nije neophodan za dokaz ispravnosti, jer testbench vec automatski poredi store adrese i podatke. Ako se ipak trazi vizuelni dodatak, u waveform treba dodati signale clk, reset, addrb_instr_32_s, instr_mem_cpu_s, wea_data_s, addra_data_32_s i dina_data_s, sa radix podesavanjem na hexadecimal.</w:t>
+      </w:r>
+    </w:p>
+    <w:p>
+      <w:pPr>
+        <w:spacing w:before="0" w:after="60" w:line="240" w:lineRule="auto"/>
+      </w:pPr>
+      <w:r>
+        <w:rPr>
+          <w:rFonts w:ascii="Calibri" w:hAnsi="Calibri"/>
+          <w:b w:val="0"/>
+          <w:sz w:val="22"/>
+        </w:rPr>
+        <w:t>Korisni primjeri za waveform su kraj Zbb demo scenarija, gdje se vidi store addr=0x00000044 data=0xFFFFF000, ili kraj prosirenog demo scenarija, gdje se vidi store addr=0x00000100 data=0x000000D6.</w:t>
+      </w:r>
+    </w:p>
+    <w:p>
+      <w:pPr>
+        <w:spacing w:before="0" w:after="60" w:line="240" w:lineRule="auto"/>
+      </w:pPr>
+      <w:r>
+        <w:rPr>
+          <w:rFonts w:ascii="Calibri" w:hAnsi="Calibri"/>
+          <w:b w:val="0"/>
+          <w:sz w:val="22"/>
+        </w:rPr>
+        <w:t>Detaljnije korak-po-korak uputstvo je sacuvano u output/vivado_uputstvo_za_pokretanje_2026-05-09.md.</w:t>
+      </w:r>
+    </w:p>
+    <w:p>
+      <w:pPr>
         <w:keepNext/>
-        <w:spacing w:before="200" w:after="120"/>
+        <w:spacing w:before="0" w:after="60" w:line="240" w:lineRule="auto"/>
         <w:rPr>
           <w:rFonts w:hint="eastAsia"/>
         </w:rPr>
@@ -3365,7 +3926,7 @@
     </w:p>
     <w:p>
       <w:pPr>
-        <w:spacing w:after="0" w:line="240" w:lineRule="auto"/>
+        <w:spacing w:after="60" w:line="240" w:lineRule="auto" w:before="0"/>
         <w:rPr>
           <w:rFonts w:hint="eastAsia"/>
         </w:rPr>

</xml_diff>